<commit_message>
1. DB Changes are updated to prevent database request timeout errors. 2. Added a universal error catch endpoint in index.js for better understanding of the error occurred. 3. Changed the date display format in TS1 JC and Report. 4. Added 'jcCreatedBy' in TS1 JC.
</commit_message>
<xml_diff>
--- a/frontend/src/templates/TS1_SRF_JC_TEMPLATE.docx
+++ b/frontend/src/templates/TS1_SRF_JC_TEMPLATE.docx
@@ -97,7 +97,25 @@
                 <w:sz w:val="24"/>
                 <w:szCs w:val="24"/>
               </w:rPr>
-              <w:t>{companyName}</w:t>
+              <w:t>{</w:t>
+            </w:r>
+            <w:proofErr w:type="spellStart"/>
+            <w:r>
+              <w:rPr>
+                <w:rFonts w:cstheme="minorHAnsi"/>
+                <w:sz w:val="24"/>
+                <w:szCs w:val="24"/>
+              </w:rPr>
+              <w:t>companyName</w:t>
+            </w:r>
+            <w:proofErr w:type="spellEnd"/>
+            <w:r>
+              <w:rPr>
+                <w:rFonts w:cstheme="minorHAnsi"/>
+                <w:sz w:val="24"/>
+                <w:szCs w:val="24"/>
+              </w:rPr>
+              <w:t>}</w:t>
             </w:r>
           </w:p>
         </w:tc>
@@ -147,7 +165,21 @@
               <w:rPr>
                 <w:rFonts w:cstheme="minorHAnsi"/>
               </w:rPr>
-              <w:t>{companyAddress}</w:t>
+              <w:t>{</w:t>
+            </w:r>
+            <w:proofErr w:type="spellStart"/>
+            <w:r>
+              <w:rPr>
+                <w:rFonts w:cstheme="minorHAnsi"/>
+              </w:rPr>
+              <w:t>companyAddress</w:t>
+            </w:r>
+            <w:proofErr w:type="spellEnd"/>
+            <w:r>
+              <w:rPr>
+                <w:rFonts w:cstheme="minorHAnsi"/>
+              </w:rPr>
+              <w:t>}</w:t>
             </w:r>
           </w:p>
         </w:tc>
@@ -199,12 +231,14 @@
               </w:rPr>
               <w:t>{</w:t>
             </w:r>
+            <w:proofErr w:type="spellStart"/>
             <w:r>
               <w:rPr>
                 <w:rFonts w:cstheme="minorHAnsi"/>
               </w:rPr>
               <w:t>projectName</w:t>
             </w:r>
+            <w:proofErr w:type="spellEnd"/>
             <w:r>
               <w:rPr>
                 <w:rFonts w:cstheme="minorHAnsi"/>
@@ -426,6 +460,7 @@
               </w:rPr>
               <w:t>{</w:t>
             </w:r>
+            <w:proofErr w:type="spellStart"/>
             <w:r>
               <w:rPr>
                 <w:rFonts w:cstheme="minorHAnsi"/>
@@ -434,6 +469,7 @@
               </w:rPr>
               <w:t>slNoCounter</w:t>
             </w:r>
+            <w:proofErr w:type="spellEnd"/>
             <w:r>
               <w:rPr>
                 <w:rFonts w:cstheme="minorHAnsi"/>
@@ -517,7 +553,25 @@
                 <w:sz w:val="21"/>
                 <w:szCs w:val="21"/>
               </w:rPr>
-              <w:t>{partNo}</w:t>
+              <w:t>{</w:t>
+            </w:r>
+            <w:proofErr w:type="spellStart"/>
+            <w:r>
+              <w:rPr>
+                <w:rFonts w:cstheme="minorHAnsi"/>
+                <w:sz w:val="21"/>
+                <w:szCs w:val="21"/>
+              </w:rPr>
+              <w:t>partNo</w:t>
+            </w:r>
+            <w:proofErr w:type="spellEnd"/>
+            <w:r>
+              <w:rPr>
+                <w:rFonts w:cstheme="minorHAnsi"/>
+                <w:sz w:val="21"/>
+                <w:szCs w:val="21"/>
+              </w:rPr>
+              <w:t>}</w:t>
             </w:r>
           </w:p>
         </w:tc>
@@ -542,7 +596,25 @@
                 <w:sz w:val="21"/>
                 <w:szCs w:val="21"/>
               </w:rPr>
-              <w:t>{modelNo}</w:t>
+              <w:t>{</w:t>
+            </w:r>
+            <w:proofErr w:type="spellStart"/>
+            <w:r>
+              <w:rPr>
+                <w:rFonts w:cstheme="minorHAnsi"/>
+                <w:sz w:val="21"/>
+                <w:szCs w:val="21"/>
+              </w:rPr>
+              <w:t>modelNo</w:t>
+            </w:r>
+            <w:proofErr w:type="spellEnd"/>
+            <w:r>
+              <w:rPr>
+                <w:rFonts w:cstheme="minorHAnsi"/>
+                <w:sz w:val="21"/>
+                <w:szCs w:val="21"/>
+              </w:rPr>
+              <w:t>}</w:t>
             </w:r>
           </w:p>
         </w:tc>
@@ -567,8 +639,27 @@
                 <w:sz w:val="21"/>
                 <w:szCs w:val="21"/>
               </w:rPr>
-              <w:t>{serialNo}{/</w:t>
-            </w:r>
+              <w:t>{</w:t>
+            </w:r>
+            <w:proofErr w:type="spellStart"/>
+            <w:r>
+              <w:rPr>
+                <w:rFonts w:cstheme="minorHAnsi"/>
+                <w:sz w:val="21"/>
+                <w:szCs w:val="21"/>
+              </w:rPr>
+              <w:t>serialNo</w:t>
+            </w:r>
+            <w:proofErr w:type="spellEnd"/>
+            <w:r>
+              <w:rPr>
+                <w:rFonts w:cstheme="minorHAnsi"/>
+                <w:sz w:val="21"/>
+                <w:szCs w:val="21"/>
+              </w:rPr>
+              <w:t>}{/</w:t>
+            </w:r>
+            <w:proofErr w:type="spellStart"/>
             <w:r>
               <w:rPr>
                 <w:rFonts w:cstheme="minorHAnsi"/>
@@ -577,7 +668,18 @@
                 <w:szCs w:val="21"/>
                 <w:shd w:val="clear" w:color="auto" w:fill="FFFFFF"/>
               </w:rPr>
-              <w:t>eutDetails}</w:t>
+              <w:t>eutDetails</w:t>
+            </w:r>
+            <w:proofErr w:type="spellEnd"/>
+            <w:r>
+              <w:rPr>
+                <w:rFonts w:cstheme="minorHAnsi"/>
+                <w:color w:val="000000"/>
+                <w:sz w:val="21"/>
+                <w:szCs w:val="21"/>
+                <w:shd w:val="clear" w:color="auto" w:fill="FFFFFF"/>
+              </w:rPr>
+              <w:t>}</w:t>
             </w:r>
           </w:p>
         </w:tc>
@@ -833,13 +935,23 @@
               </w:rPr>
               <w:t>{</w:t>
             </w:r>
-            <w:r>
-              <w:rPr>
-                <w:rFonts w:cstheme="minorHAnsi"/>
-                <w:sz w:val="21"/>
-                <w:szCs w:val="21"/>
-              </w:rPr>
-              <w:t>nabl}</w:t>
+            <w:proofErr w:type="spellStart"/>
+            <w:r>
+              <w:rPr>
+                <w:rFonts w:cstheme="minorHAnsi"/>
+                <w:sz w:val="21"/>
+                <w:szCs w:val="21"/>
+              </w:rPr>
+              <w:t>nabl</w:t>
+            </w:r>
+            <w:proofErr w:type="spellEnd"/>
+            <w:r>
+              <w:rPr>
+                <w:rFonts w:cstheme="minorHAnsi"/>
+                <w:sz w:val="21"/>
+                <w:szCs w:val="21"/>
+              </w:rPr>
+              <w:t>}</w:t>
             </w:r>
           </w:p>
         </w:tc>
@@ -864,8 +976,18 @@
                 <w:sz w:val="21"/>
                 <w:szCs w:val="21"/>
               </w:rPr>
-              <w:t>{testStandard</w:t>
-            </w:r>
+              <w:t>{</w:t>
+            </w:r>
+            <w:proofErr w:type="spellStart"/>
+            <w:r>
+              <w:rPr>
+                <w:rFonts w:cstheme="minorHAnsi"/>
+                <w:sz w:val="21"/>
+                <w:szCs w:val="21"/>
+              </w:rPr>
+              <w:t>testStandard</w:t>
+            </w:r>
+            <w:proofErr w:type="spellEnd"/>
             <w:r>
               <w:rPr>
                 <w:rFonts w:cstheme="minorHAnsi"/>
@@ -899,6 +1021,7 @@
               </w:rPr>
               <w:t>{</w:t>
             </w:r>
+            <w:proofErr w:type="spellStart"/>
             <w:r>
               <w:rPr>
                 <w:rFonts w:cstheme="minorHAnsi"/>
@@ -907,6 +1030,7 @@
               </w:rPr>
               <w:t>testProfile</w:t>
             </w:r>
+            <w:proofErr w:type="spellEnd"/>
             <w:r>
               <w:rPr>
                 <w:rFonts w:cstheme="minorHAnsi"/>
@@ -1070,7 +1194,25 @@
                 <w:sz w:val="21"/>
                 <w:szCs w:val="21"/>
               </w:rPr>
-              <w:t>{sampleCondition}</w:t>
+              <w:t>{</w:t>
+            </w:r>
+            <w:proofErr w:type="spellStart"/>
+            <w:r>
+              <w:rPr>
+                <w:rFonts w:cstheme="minorHAnsi"/>
+                <w:sz w:val="21"/>
+                <w:szCs w:val="21"/>
+              </w:rPr>
+              <w:t>sampleCondition</w:t>
+            </w:r>
+            <w:proofErr w:type="spellEnd"/>
+            <w:r>
+              <w:rPr>
+                <w:rFonts w:cstheme="minorHAnsi"/>
+                <w:sz w:val="21"/>
+                <w:szCs w:val="21"/>
+              </w:rPr>
+              <w:t>}</w:t>
             </w:r>
           </w:p>
         </w:tc>
@@ -1128,7 +1270,25 @@
                 <w:sz w:val="21"/>
                 <w:szCs w:val="21"/>
               </w:rPr>
-              <w:t>{typeOfRequest}</w:t>
+              <w:t>{</w:t>
+            </w:r>
+            <w:proofErr w:type="spellStart"/>
+            <w:r>
+              <w:rPr>
+                <w:rFonts w:cstheme="minorHAnsi"/>
+                <w:sz w:val="21"/>
+                <w:szCs w:val="21"/>
+              </w:rPr>
+              <w:t>typeOfRequest</w:t>
+            </w:r>
+            <w:proofErr w:type="spellEnd"/>
+            <w:r>
+              <w:rPr>
+                <w:rFonts w:cstheme="minorHAnsi"/>
+                <w:sz w:val="21"/>
+                <w:szCs w:val="21"/>
+              </w:rPr>
+              <w:t>}</w:t>
             </w:r>
           </w:p>
         </w:tc>
@@ -1195,7 +1355,25 @@
                 <w:sz w:val="21"/>
                 <w:szCs w:val="21"/>
               </w:rPr>
-              <w:t>{testCategory}</w:t>
+              <w:t>{</w:t>
+            </w:r>
+            <w:proofErr w:type="spellStart"/>
+            <w:r>
+              <w:rPr>
+                <w:rFonts w:cstheme="minorHAnsi"/>
+                <w:sz w:val="21"/>
+                <w:szCs w:val="21"/>
+              </w:rPr>
+              <w:t>testCategory</w:t>
+            </w:r>
+            <w:proofErr w:type="spellEnd"/>
+            <w:r>
+              <w:rPr>
+                <w:rFonts w:cstheme="minorHAnsi"/>
+                <w:sz w:val="21"/>
+                <w:szCs w:val="21"/>
+              </w:rPr>
+              <w:t>}</w:t>
             </w:r>
           </w:p>
         </w:tc>
@@ -1253,7 +1431,25 @@
                 <w:sz w:val="21"/>
                 <w:szCs w:val="21"/>
               </w:rPr>
-              <w:t>{testDiscipline}</w:t>
+              <w:t>{</w:t>
+            </w:r>
+            <w:proofErr w:type="spellStart"/>
+            <w:r>
+              <w:rPr>
+                <w:rFonts w:cstheme="minorHAnsi"/>
+                <w:sz w:val="21"/>
+                <w:szCs w:val="21"/>
+              </w:rPr>
+              <w:t>testDiscipline</w:t>
+            </w:r>
+            <w:proofErr w:type="spellEnd"/>
+            <w:r>
+              <w:rPr>
+                <w:rFonts w:cstheme="minorHAnsi"/>
+                <w:sz w:val="21"/>
+                <w:szCs w:val="21"/>
+              </w:rPr>
+              <w:t>}</w:t>
             </w:r>
           </w:p>
         </w:tc>
@@ -1311,7 +1507,25 @@
                 <w:sz w:val="21"/>
                 <w:szCs w:val="21"/>
               </w:rPr>
-              <w:t>{reportType}</w:t>
+              <w:t>{</w:t>
+            </w:r>
+            <w:proofErr w:type="spellStart"/>
+            <w:r>
+              <w:rPr>
+                <w:rFonts w:cstheme="minorHAnsi"/>
+                <w:sz w:val="21"/>
+                <w:szCs w:val="21"/>
+              </w:rPr>
+              <w:t>reportType</w:t>
+            </w:r>
+            <w:proofErr w:type="spellEnd"/>
+            <w:r>
+              <w:rPr>
+                <w:rFonts w:cstheme="minorHAnsi"/>
+                <w:sz w:val="21"/>
+                <w:szCs w:val="21"/>
+              </w:rPr>
+              <w:t>}</w:t>
             </w:r>
           </w:p>
         </w:tc>
@@ -1405,7 +1619,25 @@
                 <w:sz w:val="20"/>
                 <w:szCs w:val="20"/>
               </w:rPr>
-              <w:t>{customerName}</w:t>
+              <w:t>{</w:t>
+            </w:r>
+            <w:proofErr w:type="spellStart"/>
+            <w:r>
+              <w:rPr>
+                <w:rFonts w:cstheme="minorHAnsi"/>
+                <w:sz w:val="20"/>
+                <w:szCs w:val="20"/>
+              </w:rPr>
+              <w:t>customerName</w:t>
+            </w:r>
+            <w:proofErr w:type="spellEnd"/>
+            <w:r>
+              <w:rPr>
+                <w:rFonts w:cstheme="minorHAnsi"/>
+                <w:sz w:val="20"/>
+                <w:szCs w:val="20"/>
+              </w:rPr>
+              <w:t>}</w:t>
             </w:r>
           </w:p>
         </w:tc>
@@ -1461,7 +1693,25 @@
                 <w:sz w:val="20"/>
                 <w:szCs w:val="20"/>
               </w:rPr>
-              <w:t>{srfDate}</w:t>
+              <w:t>{</w:t>
+            </w:r>
+            <w:proofErr w:type="spellStart"/>
+            <w:r>
+              <w:rPr>
+                <w:rFonts w:cstheme="minorHAnsi"/>
+                <w:sz w:val="20"/>
+                <w:szCs w:val="20"/>
+              </w:rPr>
+              <w:t>srfDate</w:t>
+            </w:r>
+            <w:proofErr w:type="spellEnd"/>
+            <w:r>
+              <w:rPr>
+                <w:rFonts w:cstheme="minorHAnsi"/>
+                <w:sz w:val="20"/>
+                <w:szCs w:val="20"/>
+              </w:rPr>
+              <w:t>}</w:t>
             </w:r>
           </w:p>
         </w:tc>
@@ -1517,7 +1767,25 @@
                 <w:sz w:val="21"/>
                 <w:szCs w:val="21"/>
               </w:rPr>
-              <w:t>{customerPhone}</w:t>
+              <w:t>{</w:t>
+            </w:r>
+            <w:proofErr w:type="spellStart"/>
+            <w:r>
+              <w:rPr>
+                <w:rFonts w:cstheme="minorHAnsi"/>
+                <w:sz w:val="21"/>
+                <w:szCs w:val="21"/>
+              </w:rPr>
+              <w:t>customerPhone</w:t>
+            </w:r>
+            <w:proofErr w:type="spellEnd"/>
+            <w:r>
+              <w:rPr>
+                <w:rFonts w:cstheme="minorHAnsi"/>
+                <w:sz w:val="21"/>
+                <w:szCs w:val="21"/>
+              </w:rPr>
+              <w:t>}</w:t>
             </w:r>
           </w:p>
         </w:tc>
@@ -1573,7 +1841,25 @@
                 <w:sz w:val="21"/>
                 <w:szCs w:val="21"/>
               </w:rPr>
-              <w:t>{customerEmail}</w:t>
+              <w:t>{</w:t>
+            </w:r>
+            <w:proofErr w:type="spellStart"/>
+            <w:r>
+              <w:rPr>
+                <w:rFonts w:cstheme="minorHAnsi"/>
+                <w:sz w:val="21"/>
+                <w:szCs w:val="21"/>
+              </w:rPr>
+              <w:t>customerEmail</w:t>
+            </w:r>
+            <w:proofErr w:type="spellEnd"/>
+            <w:r>
+              <w:rPr>
+                <w:rFonts w:cstheme="minorHAnsi"/>
+                <w:sz w:val="21"/>
+                <w:szCs w:val="21"/>
+              </w:rPr>
+              <w:t>}</w:t>
             </w:r>
           </w:p>
         </w:tc>
@@ -1629,7 +1915,25 @@
                 <w:sz w:val="21"/>
                 <w:szCs w:val="21"/>
               </w:rPr>
-              <w:t>{testWitnessedBy}</w:t>
+              <w:t>{</w:t>
+            </w:r>
+            <w:proofErr w:type="spellStart"/>
+            <w:r>
+              <w:rPr>
+                <w:rFonts w:cstheme="minorHAnsi"/>
+                <w:sz w:val="21"/>
+                <w:szCs w:val="21"/>
+              </w:rPr>
+              <w:t>testWitnessedBy</w:t>
+            </w:r>
+            <w:proofErr w:type="spellEnd"/>
+            <w:r>
+              <w:rPr>
+                <w:rFonts w:cstheme="minorHAnsi"/>
+                <w:sz w:val="21"/>
+                <w:szCs w:val="21"/>
+              </w:rPr>
+              <w:t>}</w:t>
             </w:r>
           </w:p>
         </w:tc>
@@ -1705,7 +2009,27 @@
                 <w:sz w:val="20"/>
                 <w:szCs w:val="20"/>
               </w:rPr>
-              <w:t>{testInstructions}</w:t>
+              <w:t>{</w:t>
+            </w:r>
+            <w:proofErr w:type="spellStart"/>
+            <w:r>
+              <w:rPr>
+                <w:rFonts w:cstheme="minorHAnsi"/>
+                <w:color w:val="1F3864" w:themeColor="accent1" w:themeShade="80"/>
+                <w:sz w:val="20"/>
+                <w:szCs w:val="20"/>
+              </w:rPr>
+              <w:t>testInstructions</w:t>
+            </w:r>
+            <w:proofErr w:type="spellEnd"/>
+            <w:r>
+              <w:rPr>
+                <w:rFonts w:cstheme="minorHAnsi"/>
+                <w:color w:val="1F3864" w:themeColor="accent1" w:themeShade="80"/>
+                <w:sz w:val="20"/>
+                <w:szCs w:val="20"/>
+              </w:rPr>
+              <w:t>}</w:t>
             </w:r>
           </w:p>
         </w:tc>
@@ -2017,7 +2341,23 @@
                 <w:sz w:val="26"/>
                 <w:szCs w:val="26"/>
               </w:rPr>
-              <w:t>{srfNumber}</w:t>
+              <w:t>{</w:t>
+            </w:r>
+            <w:proofErr w:type="spellStart"/>
+            <w:r>
+              <w:rPr>
+                <w:sz w:val="26"/>
+                <w:szCs w:val="26"/>
+              </w:rPr>
+              <w:t>srfNumber</w:t>
+            </w:r>
+            <w:proofErr w:type="spellEnd"/>
+            <w:r>
+              <w:rPr>
+                <w:sz w:val="26"/>
+                <w:szCs w:val="26"/>
+              </w:rPr>
+              <w:t>}</w:t>
             </w:r>
           </w:p>
         </w:tc>
@@ -2059,6 +2399,7 @@
               </w:rPr>
               <w:t>{</w:t>
             </w:r>
+            <w:proofErr w:type="spellStart"/>
             <w:r>
               <w:rPr>
                 <w:rFonts w:cstheme="minorHAnsi"/>
@@ -2067,6 +2408,7 @@
               </w:rPr>
               <w:t>itemReceivedDate</w:t>
             </w:r>
+            <w:proofErr w:type="spellEnd"/>
             <w:r>
               <w:rPr>
                 <w:rFonts w:cstheme="minorHAnsi"/>
@@ -2100,7 +2442,25 @@
                 <w:sz w:val="21"/>
                 <w:szCs w:val="21"/>
               </w:rPr>
-              <w:t>{jcOpenDate}</w:t>
+              <w:t>{</w:t>
+            </w:r>
+            <w:proofErr w:type="spellStart"/>
+            <w:r>
+              <w:rPr>
+                <w:rFonts w:cstheme="minorHAnsi"/>
+                <w:sz w:val="21"/>
+                <w:szCs w:val="21"/>
+              </w:rPr>
+              <w:t>jcOpenDate</w:t>
+            </w:r>
+            <w:proofErr w:type="spellEnd"/>
+            <w:r>
+              <w:rPr>
+                <w:rFonts w:cstheme="minorHAnsi"/>
+                <w:sz w:val="21"/>
+                <w:szCs w:val="21"/>
+              </w:rPr>
+              <w:t>}</w:t>
             </w:r>
           </w:p>
           <w:p>
@@ -2132,7 +2492,25 @@
                 <w:sz w:val="21"/>
                 <w:szCs w:val="21"/>
               </w:rPr>
-              <w:t>{jcCloseDate}</w:t>
+              <w:t>{</w:t>
+            </w:r>
+            <w:proofErr w:type="spellStart"/>
+            <w:r>
+              <w:rPr>
+                <w:rFonts w:cstheme="minorHAnsi"/>
+                <w:sz w:val="21"/>
+                <w:szCs w:val="21"/>
+              </w:rPr>
+              <w:t>jcCloseDate</w:t>
+            </w:r>
+            <w:proofErr w:type="spellEnd"/>
+            <w:r>
+              <w:rPr>
+                <w:rFonts w:cstheme="minorHAnsi"/>
+                <w:sz w:val="21"/>
+                <w:szCs w:val="21"/>
+              </w:rPr>
+              <w:t>}</w:t>
             </w:r>
           </w:p>
         </w:tc>
@@ -2180,7 +2558,25 @@
                 <w:sz w:val="21"/>
                 <w:szCs w:val="21"/>
               </w:rPr>
-              <w:t>{jcStatus}</w:t>
+              <w:t>{</w:t>
+            </w:r>
+            <w:proofErr w:type="spellStart"/>
+            <w:r>
+              <w:rPr>
+                <w:rFonts w:cstheme="minorHAnsi"/>
+                <w:sz w:val="21"/>
+                <w:szCs w:val="21"/>
+              </w:rPr>
+              <w:t>jcStatus</w:t>
+            </w:r>
+            <w:proofErr w:type="spellEnd"/>
+            <w:r>
+              <w:rPr>
+                <w:rFonts w:cstheme="minorHAnsi"/>
+                <w:sz w:val="21"/>
+                <w:szCs w:val="21"/>
+              </w:rPr>
+              <w:t>}</w:t>
             </w:r>
           </w:p>
           <w:p>
@@ -2328,7 +2724,29 @@
                 <w:szCs w:val="21"/>
                 <w:shd w:val="clear" w:color="auto" w:fill="FFFFFF"/>
               </w:rPr>
-              <w:t>} {/testDetails}</w:t>
+              <w:t>} {/</w:t>
+            </w:r>
+            <w:proofErr w:type="spellStart"/>
+            <w:r>
+              <w:rPr>
+                <w:rFonts w:cstheme="minorHAnsi"/>
+                <w:color w:val="000000"/>
+                <w:sz w:val="21"/>
+                <w:szCs w:val="21"/>
+                <w:shd w:val="clear" w:color="auto" w:fill="FFFFFF"/>
+              </w:rPr>
+              <w:t>testDetails</w:t>
+            </w:r>
+            <w:proofErr w:type="spellEnd"/>
+            <w:r>
+              <w:rPr>
+                <w:rFonts w:cstheme="minorHAnsi"/>
+                <w:color w:val="000000"/>
+                <w:sz w:val="21"/>
+                <w:szCs w:val="21"/>
+                <w:shd w:val="clear" w:color="auto" w:fill="FFFFFF"/>
+              </w:rPr>
+              <w:t>}</w:t>
             </w:r>
           </w:p>
         </w:tc>
@@ -2875,6 +3293,7 @@
               </w:rPr>
               <w:t>{#testDetails} {</w:t>
             </w:r>
+            <w:proofErr w:type="spellStart"/>
             <w:r>
               <w:rPr>
                 <w:rFonts w:cstheme="minorHAnsi"/>
@@ -2883,6 +3302,7 @@
               </w:rPr>
               <w:t>slNoCounter</w:t>
             </w:r>
+            <w:proofErr w:type="spellEnd"/>
             <w:r>
               <w:rPr>
                 <w:rFonts w:cstheme="minorHAnsi"/>
@@ -2909,7 +3329,21 @@
               <w:rPr>
                 <w:rFonts w:cstheme="minorHAnsi"/>
               </w:rPr>
-              <w:t>{testName}</w:t>
+              <w:t>{</w:t>
+            </w:r>
+            <w:proofErr w:type="spellStart"/>
+            <w:r>
+              <w:rPr>
+                <w:rFonts w:cstheme="minorHAnsi"/>
+              </w:rPr>
+              <w:t>testName</w:t>
+            </w:r>
+            <w:proofErr w:type="spellEnd"/>
+            <w:r>
+              <w:rPr>
+                <w:rFonts w:cstheme="minorHAnsi"/>
+              </w:rPr>
+              <w:t>}</w:t>
             </w:r>
           </w:p>
         </w:tc>
@@ -2931,7 +3365,21 @@
               <w:rPr>
                 <w:rFonts w:cstheme="minorHAnsi"/>
               </w:rPr>
-              <w:t>{testChamber}</w:t>
+              <w:t>{</w:t>
+            </w:r>
+            <w:proofErr w:type="spellStart"/>
+            <w:r>
+              <w:rPr>
+                <w:rFonts w:cstheme="minorHAnsi"/>
+              </w:rPr>
+              <w:t>testChamber</w:t>
+            </w:r>
+            <w:proofErr w:type="spellEnd"/>
+            <w:r>
+              <w:rPr>
+                <w:rFonts w:cstheme="minorHAnsi"/>
+              </w:rPr>
+              <w:t>}</w:t>
             </w:r>
           </w:p>
         </w:tc>
@@ -2956,7 +3404,23 @@
                 <w:rFonts w:cstheme="minorHAnsi"/>
                 <w:bCs/>
               </w:rPr>
-              <w:t>{eutSerialNo}</w:t>
+              <w:t>{</w:t>
+            </w:r>
+            <w:proofErr w:type="spellStart"/>
+            <w:r>
+              <w:rPr>
+                <w:rFonts w:cstheme="minorHAnsi"/>
+                <w:bCs/>
+              </w:rPr>
+              <w:t>eutSerialNo</w:t>
+            </w:r>
+            <w:proofErr w:type="spellEnd"/>
+            <w:r>
+              <w:rPr>
+                <w:rFonts w:cstheme="minorHAnsi"/>
+                <w:bCs/>
+              </w:rPr>
+              <w:t>}</w:t>
             </w:r>
           </w:p>
         </w:tc>
@@ -3092,6 +3556,7 @@
               </w:rPr>
               <w:t>{/</w:t>
             </w:r>
+            <w:proofErr w:type="spellStart"/>
             <w:r>
               <w:rPr>
                 <w:rFonts w:cstheme="minorHAnsi"/>
@@ -3099,6 +3564,7 @@
               </w:rPr>
               <w:t>startDate</w:t>
             </w:r>
+            <w:proofErr w:type="spellEnd"/>
             <w:r>
               <w:rPr>
                 <w:rFonts w:cstheme="minorHAnsi"/>
@@ -3153,7 +3619,23 @@
                 <w:rFonts w:cstheme="minorHAnsi"/>
                 <w:bCs/>
               </w:rPr>
-              <w:t>{testStartedBy}</w:t>
+              <w:t>{</w:t>
+            </w:r>
+            <w:proofErr w:type="spellStart"/>
+            <w:r>
+              <w:rPr>
+                <w:rFonts w:cstheme="minorHAnsi"/>
+                <w:bCs/>
+              </w:rPr>
+              <w:t>testStartedBy</w:t>
+            </w:r>
+            <w:proofErr w:type="spellEnd"/>
+            <w:r>
+              <w:rPr>
+                <w:rFonts w:cstheme="minorHAnsi"/>
+                <w:bCs/>
+              </w:rPr>
+              <w:t>}</w:t>
             </w:r>
           </w:p>
         </w:tc>
@@ -3268,7 +3750,15 @@
                 <w:rFonts w:cstheme="minorHAnsi"/>
                 <w:bCs/>
               </w:rPr>
-              <w:t>/end</w:t>
+              <w:t>/</w:t>
+            </w:r>
+            <w:proofErr w:type="spellStart"/>
+            <w:r>
+              <w:rPr>
+                <w:rFonts w:cstheme="minorHAnsi"/>
+                <w:bCs/>
+              </w:rPr>
+              <w:t>end</w:t>
             </w:r>
             <w:r>
               <w:rPr>
@@ -3277,6 +3767,7 @@
               </w:rPr>
               <w:t>Date</w:t>
             </w:r>
+            <w:proofErr w:type="spellEnd"/>
             <w:r>
               <w:rPr>
                 <w:rFonts w:cstheme="minorHAnsi"/>
@@ -3331,7 +3822,23 @@
                 <w:rFonts w:cstheme="minorHAnsi"/>
                 <w:bCs/>
               </w:rPr>
-              <w:t>{testEndedBy}</w:t>
+              <w:t>{</w:t>
+            </w:r>
+            <w:proofErr w:type="spellStart"/>
+            <w:r>
+              <w:rPr>
+                <w:rFonts w:cstheme="minorHAnsi"/>
+                <w:bCs/>
+              </w:rPr>
+              <w:t>testEndedBy</w:t>
+            </w:r>
+            <w:proofErr w:type="spellEnd"/>
+            <w:r>
+              <w:rPr>
+                <w:rFonts w:cstheme="minorHAnsi"/>
+                <w:bCs/>
+              </w:rPr>
+              <w:t>}</w:t>
             </w:r>
           </w:p>
         </w:tc>
@@ -3380,7 +3887,15 @@
                 <w:rFonts w:cstheme="minorHAnsi"/>
                 <w:bCs/>
               </w:rPr>
-              <w:t>{testRe</w:t>
+              <w:t>{</w:t>
+            </w:r>
+            <w:proofErr w:type="spellStart"/>
+            <w:r>
+              <w:rPr>
+                <w:rFonts w:cstheme="minorHAnsi"/>
+                <w:bCs/>
+              </w:rPr>
+              <w:t>testRe</w:t>
             </w:r>
             <w:r>
               <w:rPr>
@@ -3408,7 +3923,15 @@
                 <w:rFonts w:cstheme="minorHAnsi"/>
                 <w:bCs/>
               </w:rPr>
-              <w:t>dBy}</w:t>
+              <w:t>dBy</w:t>
+            </w:r>
+            <w:proofErr w:type="spellEnd"/>
+            <w:r>
+              <w:rPr>
+                <w:rFonts w:cstheme="minorHAnsi"/>
+                <w:bCs/>
+              </w:rPr>
+              <w:t>}</w:t>
             </w:r>
           </w:p>
         </w:tc>
@@ -3436,12 +3959,14 @@
               </w:rPr>
               <w:t>{</w:t>
             </w:r>
+            <w:proofErr w:type="spellStart"/>
             <w:r>
               <w:rPr>
                 <w:rFonts w:cstheme="minorHAnsi"/>
               </w:rPr>
               <w:t>actualTestDuration</w:t>
             </w:r>
+            <w:proofErr w:type="spellEnd"/>
             <w:r>
               <w:rPr>
                 <w:rFonts w:cstheme="minorHAnsi"/>
@@ -3498,7 +4023,21 @@
               <w:rPr>
                 <w:rFonts w:cstheme="minorHAnsi"/>
               </w:rPr>
-              <w:t>{reportNumber}</w:t>
+              <w:t>{</w:t>
+            </w:r>
+            <w:proofErr w:type="spellStart"/>
+            <w:r>
+              <w:rPr>
+                <w:rFonts w:cstheme="minorHAnsi"/>
+              </w:rPr>
+              <w:t>reportNumber</w:t>
+            </w:r>
+            <w:proofErr w:type="spellEnd"/>
+            <w:r>
+              <w:rPr>
+                <w:rFonts w:cstheme="minorHAnsi"/>
+              </w:rPr>
+              <w:t>}</w:t>
             </w:r>
           </w:p>
         </w:tc>
@@ -3525,7 +4064,25 @@
                 <w:color w:val="000000"/>
                 <w:shd w:val="clear" w:color="auto" w:fill="FFFFFF"/>
               </w:rPr>
-              <w:t>{preparedBy}</w:t>
+              <w:t>{</w:t>
+            </w:r>
+            <w:proofErr w:type="spellStart"/>
+            <w:r>
+              <w:rPr>
+                <w:rFonts w:cstheme="minorHAnsi"/>
+                <w:color w:val="000000"/>
+                <w:shd w:val="clear" w:color="auto" w:fill="FFFFFF"/>
+              </w:rPr>
+              <w:t>preparedBy</w:t>
+            </w:r>
+            <w:proofErr w:type="spellEnd"/>
+            <w:r>
+              <w:rPr>
+                <w:rFonts w:cstheme="minorHAnsi"/>
+                <w:color w:val="000000"/>
+                <w:shd w:val="clear" w:color="auto" w:fill="FFFFFF"/>
+              </w:rPr>
+              <w:t>}</w:t>
             </w:r>
           </w:p>
           <w:p>
@@ -3547,7 +4104,25 @@
                 <w:color w:val="000000"/>
                 <w:shd w:val="clear" w:color="auto" w:fill="FFFFFF"/>
               </w:rPr>
-              <w:t>{/testDetails}</w:t>
+              <w:t>{/</w:t>
+            </w:r>
+            <w:proofErr w:type="spellStart"/>
+            <w:r>
+              <w:rPr>
+                <w:rFonts w:cstheme="minorHAnsi"/>
+                <w:color w:val="000000"/>
+                <w:shd w:val="clear" w:color="auto" w:fill="FFFFFF"/>
+              </w:rPr>
+              <w:t>testDetails</w:t>
+            </w:r>
+            <w:proofErr w:type="spellEnd"/>
+            <w:r>
+              <w:rPr>
+                <w:rFonts w:cstheme="minorHAnsi"/>
+                <w:color w:val="000000"/>
+                <w:shd w:val="clear" w:color="auto" w:fill="FFFFFF"/>
+              </w:rPr>
+              <w:t>}</w:t>
             </w:r>
           </w:p>
         </w:tc>
@@ -3611,7 +4186,25 @@
                 <w:sz w:val="21"/>
                 <w:szCs w:val="21"/>
               </w:rPr>
-              <w:t>{jcOpenDate}</w:t>
+              <w:t>{</w:t>
+            </w:r>
+            <w:proofErr w:type="spellStart"/>
+            <w:r>
+              <w:rPr>
+                <w:rFonts w:cstheme="minorHAnsi"/>
+                <w:sz w:val="21"/>
+                <w:szCs w:val="21"/>
+              </w:rPr>
+              <w:t>jcOpenDate</w:t>
+            </w:r>
+            <w:proofErr w:type="spellEnd"/>
+            <w:r>
+              <w:rPr>
+                <w:rFonts w:cstheme="minorHAnsi"/>
+                <w:sz w:val="21"/>
+                <w:szCs w:val="21"/>
+              </w:rPr>
+              <w:t>}</w:t>
             </w:r>
           </w:p>
         </w:tc>
@@ -3653,15 +4246,53 @@
               <w:jc w:val="center"/>
               <w:rPr>
                 <w:rFonts w:cstheme="minorHAnsi"/>
-              </w:rPr>
-            </w:pPr>
-            <w:r>
-              <w:rPr>
-                <w:rFonts w:cstheme="minorHAnsi"/>
-                <w:sz w:val="21"/>
-                <w:szCs w:val="21"/>
-              </w:rPr>
-              <w:t>{testIncharge}</w:t>
+                <w:sz w:val="21"/>
+                <w:szCs w:val="21"/>
+              </w:rPr>
+            </w:pPr>
+            <w:r>
+              <w:rPr>
+                <w:rFonts w:cstheme="minorHAnsi"/>
+                <w:sz w:val="21"/>
+                <w:szCs w:val="21"/>
+              </w:rPr>
+              <w:t>{</w:t>
+            </w:r>
+            <w:proofErr w:type="spellStart"/>
+            <w:r>
+              <w:rPr>
+                <w:rFonts w:cstheme="minorHAnsi"/>
+                <w:sz w:val="21"/>
+                <w:szCs w:val="21"/>
+              </w:rPr>
+              <w:t>jcCreatedBy</w:t>
+            </w:r>
+            <w:proofErr w:type="spellEnd"/>
+            <w:r>
+              <w:rPr>
+                <w:rFonts w:cstheme="minorHAnsi"/>
+                <w:sz w:val="21"/>
+                <w:szCs w:val="21"/>
+              </w:rPr>
+              <w:t>}</w:t>
+            </w:r>
+          </w:p>
+          <w:p>
+            <w:pPr>
+              <w:spacing w:after="0" w:line="240" w:lineRule="auto"/>
+              <w:ind w:left="1962" w:hanging="221"/>
+              <w:jc w:val="center"/>
+              <w:rPr>
+                <w:rFonts w:cstheme="minorHAnsi"/>
+              </w:rPr>
+            </w:pPr>
+            <w:r>
+              <w:rPr>
+                <w:rFonts w:cstheme="minorHAnsi"/>
+                <w:sz w:val="21"/>
+                <w:szCs w:val="21"/>
+              </w:rPr>
+              <w:t>JC Created By</w:t>
             </w:r>
           </w:p>
           <w:p>
@@ -3798,7 +4429,29 @@
         <w:sz w:val="20"/>
         <w:szCs w:val="20"/>
       </w:rPr>
-      <w:t xml:space="preserve">Analytic Solutions LLP, #B131/A, Devasandra Industrial Estate, Whitefield Road, Mahadevapura, Bangalore – 560048, India. </w:t>
+      <w:t xml:space="preserve">Analytic Solutions LLP, #B131/A, </w:t>
+    </w:r>
+    <w:proofErr w:type="spellStart"/>
+    <w:r>
+      <w:rPr>
+        <w:rFonts w:ascii="Calibri" w:hAnsi="Calibri" w:cs="Calibri"/>
+        <w:b/>
+        <w:color w:val="000000" w:themeColor="text1"/>
+        <w:sz w:val="20"/>
+        <w:szCs w:val="20"/>
+      </w:rPr>
+      <w:t>Devasandra</w:t>
+    </w:r>
+    <w:proofErr w:type="spellEnd"/>
+    <w:r>
+      <w:rPr>
+        <w:rFonts w:ascii="Calibri" w:hAnsi="Calibri" w:cs="Calibri"/>
+        <w:b/>
+        <w:color w:val="000000" w:themeColor="text1"/>
+        <w:sz w:val="20"/>
+        <w:szCs w:val="20"/>
+      </w:rPr>
+      <w:t xml:space="preserve"> Industrial Estate, Whitefield Road, Mahadevapura, Bangalore – 560048, India. </w:t>
     </w:r>
     <w:r>
       <w:rPr>
@@ -3958,7 +4611,23 @@
                               <w:sz w:val="24"/>
                               <w:szCs w:val="24"/>
                             </w:rPr>
-                            <w:t>{srfNumber}</w:t>
+                            <w:t>{</w:t>
+                          </w:r>
+                          <w:proofErr w:type="spellStart"/>
+                          <w:r>
+                            <w:rPr>
+                              <w:sz w:val="24"/>
+                              <w:szCs w:val="24"/>
+                            </w:rPr>
+                            <w:t>srfNumber</w:t>
+                          </w:r>
+                          <w:proofErr w:type="spellEnd"/>
+                          <w:r>
+                            <w:rPr>
+                              <w:sz w:val="24"/>
+                              <w:szCs w:val="24"/>
+                            </w:rPr>
+                            <w:t>}</w:t>
                           </w:r>
                           <w:r>
                             <w:rPr>
@@ -4294,7 +4963,27 @@
                               <w:sz w:val="28"/>
                               <w:szCs w:val="28"/>
                             </w:rPr>
-                            <w:t>{jcNumber}</w:t>
+                            <w:t>{</w:t>
+                          </w:r>
+                          <w:proofErr w:type="spellStart"/>
+                          <w:r>
+                            <w:rPr>
+                              <w:b/>
+                              <w:bCs/>
+                              <w:sz w:val="28"/>
+                              <w:szCs w:val="28"/>
+                            </w:rPr>
+                            <w:t>jcNumber</w:t>
+                          </w:r>
+                          <w:proofErr w:type="spellEnd"/>
+                          <w:r>
+                            <w:rPr>
+                              <w:b/>
+                              <w:bCs/>
+                              <w:sz w:val="28"/>
+                              <w:szCs w:val="28"/>
+                            </w:rPr>
+                            <w:t>}</w:t>
                           </w:r>
                         </w:p>
                         <w:p>
@@ -5148,7 +5837,6 @@
   <w:style w:type="character" w:default="1" w:styleId="DefaultParagraphFont">
     <w:name w:val="Default Paragraph Font"/>
     <w:uiPriority w:val="1"/>
-    <w:semiHidden/>
     <w:unhideWhenUsed/>
   </w:style>
   <w:style w:type="table" w:default="1" w:styleId="TableNormal">

</xml_diff>